<commit_message>
Auto-save: 47 file(s) — 2026-08-25 15:14
</commit_message>
<xml_diff>
--- a/Projects/NEPRA Follow-Up Letters/02_AL_MOIZ_Industries_Limited.docx
+++ b/Projects/NEPRA Follow-Up Letters/02_AL_MOIZ_Industries_Limited.docx
@@ -641,7 +641,7 @@
       <w:r>
         <w:rPr>
           <w:rFonts w:ascii="Poppins" w:eastAsia="Calibri" w:hAnsi="Poppins" w:cs="Poppins"/>
-          <w:color w:val="6E6E6E"/>
+          <w:color w:val="3A3A3A"/>
           <w:sz w:val="19"/>
           <w:szCs w:val="19"/>
         </w:rPr>
@@ -659,9 +659,11 @@
       <w:r>
         <w:rPr>
           <w:rFonts w:ascii="Poppins" w:hAnsi="Poppins" w:cs="Poppins"/>
-          <w:sz w:val="19"/>
-          <w:szCs w:val="19"/>
-        </w:rPr>
+          <w:color w:val="3A3A3A"/>
+          <w:sz w:val="19"/>
+          <w:szCs w:val="19"/>
+        </w:rPr>
+        <w:lastRenderedPageBreak/>
         <w:t>Phone: 0322-2009713</w:t>
       </w:r>
     </w:p>

</xml_diff>